<commit_message>
Description des modificatio 8111111331114411111111111ثثثثثثثثثثfffffffffgggggggege;jkkkkkmmmppp
</commit_message>
<xml_diff>
--- a/TDs/Doc1.docx
+++ b/TDs/Doc1.docx
@@ -1041,7 +1041,7 @@
           </mc:Choice>
           <mc:Fallback>
             <w:pict>
-              <v:shapetype w14:anchorId="4CA75487" id="_x0000_t34" coordsize="21600,21600" o:spt="34" o:oned="t" adj="10800" path="m,l@0,0@0,21600,21600,21600e" filled="f">
+              <v:shapetype w14:anchorId="0705AC3B" id="_x0000_t34" coordsize="21600,21600" o:spt="34" o:oned="t" adj="10800" path="m,l@0,0@0,21600,21600,21600e" filled="f">
                 <v:stroke joinstyle="miter"/>
                 <v:formulas>
                   <v:f eqn="val #0"/>
@@ -2244,7 +2244,7 @@
           </mc:Choice>
           <mc:Fallback>
             <w:pict>
-              <v:shape w14:anchorId="729C9F46" id="Connecteur : en angle 28" o:spid="_x0000_s1026" type="#_x0000_t34" style="position:absolute;margin-left:239.05pt;margin-top:276pt;width:232.25pt;height:66.35pt;flip:x y;z-index:251816960;visibility:visible;mso-wrap-style:square;mso-width-percent:0;mso-height-percent:0;mso-wrap-distance-left:9pt;mso-wrap-distance-top:0;mso-wrap-distance-right:9pt;mso-wrap-distance-bottom:0;mso-position-horizontal:absolute;mso-position-horizontal-relative:text;mso-position-vertical:absolute;mso-position-vertical-relative:text;mso-width-percent:0;mso-height-percent:0;mso-width-relative:margin;mso-height-relative:margin" o:gfxdata="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" adj="82" strokecolor="#e00" strokeweight=".5pt">
+              <v:shape w14:anchorId="7E03C20D" id="Connecteur : en angle 28" o:spid="_x0000_s1026" type="#_x0000_t34" style="position:absolute;margin-left:239.05pt;margin-top:276pt;width:232.25pt;height:66.35pt;flip:x y;z-index:251816960;visibility:visible;mso-wrap-style:square;mso-width-percent:0;mso-height-percent:0;mso-wrap-distance-left:9pt;mso-wrap-distance-top:0;mso-wrap-distance-right:9pt;mso-wrap-distance-bottom:0;mso-position-horizontal:absolute;mso-position-horizontal-relative:text;mso-position-vertical:absolute;mso-position-vertical-relative:text;mso-width-percent:0;mso-height-percent:0;mso-width-relative:margin;mso-height-relative:margin" o:gfxdata="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" adj="82" strokecolor="#e00" strokeweight=".5pt">
                 <v:stroke endarrow="block"/>
               </v:shape>
             </w:pict>
@@ -5592,7 +5592,7 @@
           </mc:Choice>
           <mc:Fallback>
             <w:pict>
-              <v:line w14:anchorId="20335520" id="Connecteur droit 1" o:spid="_x0000_s1026" style="position:absolute;z-index:251682816;visibility:visible;mso-wrap-style:square;mso-wrap-distance-left:9pt;mso-wrap-distance-top:0;mso-wrap-distance-right:9pt;mso-wrap-distance-bottom:0;mso-position-horizontal:absolute;mso-position-horizontal-relative:text;mso-position-vertical:absolute;mso-position-vertical-relative:text" from="1in,22.95pt" to="1in,28.7pt" o:gfxdata="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" strokecolor="black [3213]" strokeweight=".5pt">
+              <v:line w14:anchorId="722341E2" id="Connecteur droit 1" o:spid="_x0000_s1026" style="position:absolute;z-index:251682816;visibility:visible;mso-wrap-style:square;mso-wrap-distance-left:9pt;mso-wrap-distance-top:0;mso-wrap-distance-right:9pt;mso-wrap-distance-bottom:0;mso-position-horizontal:absolute;mso-position-horizontal-relative:text;mso-position-vertical:absolute;mso-position-vertical-relative:text" from="1in,22.95pt" to="1in,28.7pt" o:gfxdata="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" strokecolor="black [3213]" strokeweight=".5pt">
                 <v:stroke joinstyle="miter"/>
               </v:line>
             </w:pict>
@@ -5694,7 +5694,7 @@
           </mc:Choice>
           <mc:Fallback>
             <w:pict>
-              <v:line w14:anchorId="316630B3" id="Connecteur droit 10" o:spid="_x0000_s1026" style="position:absolute;flip:y;z-index:251729920;visibility:visible;mso-wrap-style:square;mso-width-percent:0;mso-height-percent:0;mso-wrap-distance-left:9pt;mso-wrap-distance-top:0;mso-wrap-distance-right:9pt;mso-wrap-distance-bottom:0;mso-position-horizontal:absolute;mso-position-horizontal-relative:text;mso-position-vertical:absolute;mso-position-vertical-relative:text;mso-width-percent:0;mso-height-percent:0;mso-width-relative:margin;mso-height-relative:margin" from="89.6pt,21.95pt" to="97.5pt,21.95pt" o:gfxdata="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" strokecolor="black [3213]" strokeweight="3pt">
+              <v:line w14:anchorId="7225EE25" id="Connecteur droit 10" o:spid="_x0000_s1026" style="position:absolute;flip:y;z-index:251729920;visibility:visible;mso-wrap-style:square;mso-width-percent:0;mso-height-percent:0;mso-wrap-distance-left:9pt;mso-wrap-distance-top:0;mso-wrap-distance-right:9pt;mso-wrap-distance-bottom:0;mso-position-horizontal:absolute;mso-position-horizontal-relative:text;mso-position-vertical:absolute;mso-position-vertical-relative:text;mso-width-percent:0;mso-height-percent:0;mso-width-relative:margin;mso-height-relative:margin" from="89.6pt,21.95pt" to="97.5pt,21.95pt" o:gfxdata="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" strokecolor="black [3213]" strokeweight="3pt">
                 <v:stroke joinstyle="miter"/>
               </v:line>
             </w:pict>
@@ -6085,7 +6085,7 @@
           </mc:Choice>
           <mc:Fallback>
             <w:pict>
-              <v:group w14:anchorId="34626783" id="Groupe 3" o:spid="_x0000_s1026" style="position:absolute;margin-left:-33.95pt;margin-top:2.95pt;width:534.55pt;height:358.05pt;z-index:251679744" coordsize="67886,45472" o:gfxdata="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">
+              <v:group w14:anchorId="7B90D6A8" id="Groupe 3" o:spid="_x0000_s1026" style="position:absolute;margin-left:-33.95pt;margin-top:2.95pt;width:534.55pt;height:358.05pt;z-index:251679744" coordsize="67886,45472" o:gfxdata="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">
                 <v:shape id="Image 1" o:spid="_x0000_s1027" type="#_x0000_t75" style="position:absolute;top:73;width:35477;height:35858;visibility:visible;mso-wrap-style:square" o:gfxdata="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">
                   <v:imagedata r:id="rId31" o:title=""/>
                 </v:shape>
@@ -6503,96 +6503,18 @@
         <mc:AlternateContent>
           <mc:Choice Requires="wps">
             <w:drawing>
-              <wp:anchor distT="0" distB="0" distL="114300" distR="114300" simplePos="0" relativeHeight="251810816" behindDoc="0" locked="0" layoutInCell="1" allowOverlap="1" wp14:anchorId="1266F3F0" wp14:editId="15A317E4">
+              <wp:anchor distT="0" distB="0" distL="114300" distR="114300" simplePos="0" relativeHeight="251805696" behindDoc="0" locked="0" layoutInCell="1" allowOverlap="1" wp14:anchorId="47AD4C23" wp14:editId="7359B2D5">
                 <wp:simplePos x="0" y="0"/>
-                <wp:positionH relativeFrom="leftMargin">
-                  <wp:posOffset>365760</wp:posOffset>
+                <wp:positionH relativeFrom="page">
+                  <wp:align>right</wp:align>
                 </wp:positionH>
                 <wp:positionV relativeFrom="paragraph">
-                  <wp:posOffset>5397444</wp:posOffset>
+                  <wp:posOffset>5126990</wp:posOffset>
                 </wp:positionV>
-                <wp:extent cx="604299" cy="1972558"/>
-                <wp:effectExtent l="0" t="76200" r="0" b="27940"/>
+                <wp:extent cx="2114329" cy="1661823"/>
+                <wp:effectExtent l="0" t="0" r="19685" b="14605"/>
                 <wp:wrapNone/>
-                <wp:docPr id="2137952318" name="Connecteur : en angle 27"/>
-                <wp:cNvGraphicFramePr/>
-                <a:graphic xmlns:a="http://schemas.openxmlformats.org/drawingml/2006/main">
-                  <a:graphicData uri="http://schemas.microsoft.com/office/word/2010/wordprocessingShape">
-                    <wps:wsp>
-                      <wps:cNvCnPr/>
-                      <wps:spPr>
-                        <a:xfrm flipV="1">
-                          <a:off x="0" y="0"/>
-                          <a:ext cx="604299" cy="1972558"/>
-                        </a:xfrm>
-                        <a:prstGeom prst="bentConnector3">
-                          <a:avLst>
-                            <a:gd name="adj1" fmla="val 32615"/>
-                          </a:avLst>
-                        </a:prstGeom>
-                        <a:ln>
-                          <a:solidFill>
-                            <a:srgbClr val="EE0000"/>
-                          </a:solidFill>
-                          <a:tailEnd type="triangle"/>
-                        </a:ln>
-                      </wps:spPr>
-                      <wps:style>
-                        <a:lnRef idx="1">
-                          <a:schemeClr val="accent1"/>
-                        </a:lnRef>
-                        <a:fillRef idx="0">
-                          <a:schemeClr val="accent1"/>
-                        </a:fillRef>
-                        <a:effectRef idx="0">
-                          <a:schemeClr val="accent1"/>
-                        </a:effectRef>
-                        <a:fontRef idx="minor">
-                          <a:schemeClr val="tx1"/>
-                        </a:fontRef>
-                      </wps:style>
-                      <wps:bodyPr/>
-                    </wps:wsp>
-                  </a:graphicData>
-                </a:graphic>
-                <wp14:sizeRelH relativeFrom="margin">
-                  <wp14:pctWidth>0</wp14:pctWidth>
-                </wp14:sizeRelH>
-                <wp14:sizeRelV relativeFrom="margin">
-                  <wp14:pctHeight>0</wp14:pctHeight>
-                </wp14:sizeRelV>
-              </wp:anchor>
-            </w:drawing>
-          </mc:Choice>
-          <mc:Fallback>
-            <w:pict>
-              <v:shape w14:anchorId="27DC8603" id="Connecteur : en angle 27" o:spid="_x0000_s1026" type="#_x0000_t34" style="position:absolute;margin-left:28.8pt;margin-top:425pt;width:47.6pt;height:155.3pt;flip:y;z-index:251810816;visibility:visible;mso-wrap-style:square;mso-width-percent:0;mso-height-percent:0;mso-wrap-distance-left:9pt;mso-wrap-distance-top:0;mso-wrap-distance-right:9pt;mso-wrap-distance-bottom:0;mso-position-horizontal:absolute;mso-position-horizontal-relative:left-margin-area;mso-position-vertical:absolute;mso-position-vertical-relative:text;mso-width-percent:0;mso-height-percent:0;mso-width-relative:margin;mso-height-relative:margin" o:gfxdata="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" adj="7045" strokecolor="#e00" strokeweight=".5pt">
-                <v:stroke endarrow="block"/>
-                <w10:wrap anchorx="margin"/>
-              </v:shape>
-            </w:pict>
-          </mc:Fallback>
-        </mc:AlternateContent>
-      </w:r>
-      <w:r>
-        <w:rPr>
-          <w:noProof/>
-        </w:rPr>
-        <mc:AlternateContent>
-          <mc:Choice Requires="wps">
-            <w:drawing>
-              <wp:anchor distT="0" distB="0" distL="114300" distR="114300" simplePos="0" relativeHeight="251808768" behindDoc="0" locked="0" layoutInCell="1" allowOverlap="1" wp14:anchorId="5E6B73F4" wp14:editId="5D95ADAC">
-                <wp:simplePos x="0" y="0"/>
-                <wp:positionH relativeFrom="page">
-                  <wp:posOffset>262393</wp:posOffset>
-                </wp:positionH>
-                <wp:positionV relativeFrom="paragraph">
-                  <wp:posOffset>7385270</wp:posOffset>
-                </wp:positionV>
-                <wp:extent cx="2099144" cy="1979875"/>
-                <wp:effectExtent l="0" t="0" r="15875" b="20955"/>
-                <wp:wrapNone/>
-                <wp:docPr id="886192443" name="Zone de texte 26"/>
+                <wp:docPr id="1445852579" name="Zone de texte 26"/>
                 <wp:cNvGraphicFramePr/>
                 <a:graphic xmlns:a="http://schemas.openxmlformats.org/drawingml/2006/main">
                   <a:graphicData uri="http://schemas.microsoft.com/office/word/2010/wordprocessingShape">
@@ -6601,7 +6523,7 @@
                       <wps:spPr>
                         <a:xfrm>
                           <a:off x="0" y="0"/>
-                          <a:ext cx="2099144" cy="1979875"/>
+                          <a:ext cx="2114329" cy="1661823"/>
                         </a:xfrm>
                         <a:prstGeom prst="rect">
                           <a:avLst/>
@@ -6630,617 +6552,7 @@
                         <w:txbxContent>
                           <w:p>
                             <w:pPr>
-                              <w:jc w:val="center"/>
-                              <w:rPr>
-                                <w:rFonts w:eastAsiaTheme="minorEastAsia"/>
-                              </w:rPr>
-                            </w:pPr>
-                            <m:oMath>
-                              <m:sSub>
-                                <m:sSubPr>
-                                  <m:ctrlPr>
-                                    <w:rPr>
-                                      <w:rFonts w:ascii="Cambria Math" w:hAnsi="Cambria Math"/>
-                                      <w:i/>
-                                    </w:rPr>
-                                  </m:ctrlPr>
-                                </m:sSubPr>
-                                <m:e>
-                                  <m:r>
-                                    <w:rPr>
-                                      <w:rFonts w:ascii="Cambria Math" w:hAnsi="Cambria Math"/>
-                                    </w:rPr>
-                                    <m:t>B</m:t>
-                                  </m:r>
-                                </m:e>
-                                <m:sub>
-                                  <m:r>
-                                    <w:rPr>
-                                      <w:rFonts w:ascii="Cambria Math" w:hAnsi="Cambria Math"/>
-                                    </w:rPr>
-                                    <m:t>k</m:t>
-                                  </m:r>
-                                </m:sub>
-                              </m:sSub>
-                              <m:r>
-                                <w:rPr>
-                                  <w:rFonts w:ascii="Cambria Math" w:hAnsi="Cambria Math"/>
-                                </w:rPr>
-                                <m:t>=</m:t>
-                              </m:r>
-                              <m:r>
-                                <w:rPr>
-                                  <w:rFonts w:ascii="Cambria Math" w:hAnsi="Cambria Math"/>
-                                </w:rPr>
-                                <m:t>A</m:t>
-                              </m:r>
-                            </m:oMath>
-                            <w:r>
-                              <w:rPr>
-                                <w:rFonts w:eastAsiaTheme="minorEastAsia"/>
-                              </w:rPr>
-                              <w:t> ;</w:t>
-                            </w:r>
-                          </w:p>
-                          <w:p>
-                            <w:pPr>
-                              <w:jc w:val="center"/>
-                              <w:rPr>
-                                <w:rFonts w:ascii="Cambria Math" w:eastAsiaTheme="minorEastAsia" w:hAnsi="Cambria Math"/>
-                                <w:i/>
-                              </w:rPr>
-                            </w:pPr>
-                            <m:oMathPara>
-                              <m:oMath>
-                                <m:sSub>
-                                  <m:sSubPr>
-                                    <m:ctrlPr>
-                                      <w:rPr>
-                                        <w:rFonts w:ascii="Cambria Math" w:hAnsi="Cambria Math"/>
-                                        <w:i/>
-                                      </w:rPr>
-                                    </m:ctrlPr>
-                                  </m:sSubPr>
-                                  <m:e>
-                                    <m:r>
-                                      <w:rPr>
-                                        <w:rFonts w:ascii="Cambria Math" w:hAnsi="Cambria Math"/>
-                                      </w:rPr>
-                                      <m:t>A</m:t>
-                                    </m:r>
-                                  </m:e>
-                                  <m:sub>
-                                    <m:r>
-                                      <w:rPr>
-                                        <w:rFonts w:ascii="Cambria Math" w:hAnsi="Cambria Math"/>
-                                      </w:rPr>
-                                      <m:t>k</m:t>
-                                    </m:r>
-                                  </m:sub>
-                                </m:sSub>
-                                <m:r>
-                                  <w:rPr>
-                                    <w:rFonts w:ascii="Cambria Math" w:hAnsi="Cambria Math"/>
-                                  </w:rPr>
-                                  <m:t>=</m:t>
-                                </m:r>
-                                <m:r>
-                                  <w:rPr>
-                                    <w:rFonts w:ascii="Cambria Math" w:hAnsi="Cambria Math"/>
-                                  </w:rPr>
-                                  <m:t>O</m:t>
-                                </m:r>
-                              </m:oMath>
-                            </m:oMathPara>
-                          </w:p>
-                          <w:p>
-                            <w:pPr>
-                              <w:jc w:val="center"/>
-                            </w:pPr>
-                            <w:r>
-                              <w:rPr>
-                                <w:rFonts w:ascii="Cambria Math" w:eastAsiaTheme="minorEastAsia" w:hAnsi="Cambria Math"/>
-                                <w:i/>
-                                <w:highlight w:val="yellow"/>
-                              </w:rPr>
-                              <w:t xml:space="preserve">C’est-à-dire point appartient repère k dont notre cas </w:t>
-                            </w:r>
-                            <w:r>
-                              <w:rPr>
-                                <w:rFonts w:ascii="Cambria Math" w:eastAsiaTheme="minorEastAsia" w:hAnsi="Cambria Math"/>
-                                <w:i/>
-                                <w:highlight w:val="yellow"/>
-                              </w:rPr>
-                              <w:t>A</w:t>
-                            </w:r>
-                            <w:r>
-                              <w:rPr>
-                                <w:rFonts w:ascii="Cambria Math" w:eastAsiaTheme="minorEastAsia" w:hAnsi="Cambria Math"/>
-                                <w:i/>
-                                <w:highlight w:val="yellow"/>
-                              </w:rPr>
-                              <w:t xml:space="preserve"> appartient R</w:t>
-                            </w:r>
-                            <w:r>
-                              <w:rPr>
-                                <w:rFonts w:ascii="Cambria Math" w:eastAsiaTheme="minorEastAsia" w:hAnsi="Cambria Math"/>
-                                <w:i/>
-                                <w:highlight w:val="yellow"/>
-                              </w:rPr>
-                              <w:t>1</w:t>
-                            </w:r>
-                            <w:r>
-                              <w:rPr>
-                                <w:rFonts w:ascii="Cambria Math" w:eastAsiaTheme="minorEastAsia" w:hAnsi="Cambria Math"/>
-                                <w:i/>
-                                <w:highlight w:val="yellow"/>
-                              </w:rPr>
-                              <w:t xml:space="preserve"> donc k=</w:t>
-                            </w:r>
-                            <w:r>
-                              <w:rPr>
-                                <w:rFonts w:ascii="Cambria Math" w:eastAsiaTheme="minorEastAsia" w:hAnsi="Cambria Math"/>
-                                <w:i/>
-                                <w:highlight w:val="yellow"/>
-                              </w:rPr>
-                              <w:t>1</w:t>
-                            </w:r>
-                            <w:r>
-                              <w:rPr>
-                                <w:rFonts w:ascii="Cambria Math" w:eastAsiaTheme="minorEastAsia" w:hAnsi="Cambria Math"/>
-                                <w:i/>
-                                <w:highlight w:val="yellow"/>
-                              </w:rPr>
-                              <w:t xml:space="preserve"> et on ne cherche point </w:t>
-                            </w:r>
-                            <m:oMath>
-                              <m:sSub>
-                                <m:sSubPr>
-                                  <m:ctrlPr>
-                                    <w:rPr>
-                                      <w:rFonts w:ascii="Cambria Math" w:hAnsi="Cambria Math"/>
-                                      <w:i/>
-                                      <w:highlight w:val="yellow"/>
-                                    </w:rPr>
-                                  </m:ctrlPr>
-                                </m:sSubPr>
-                                <m:e>
-                                  <m:r>
-                                    <w:rPr>
-                                      <w:rFonts w:ascii="Cambria Math" w:hAnsi="Cambria Math"/>
-                                      <w:highlight w:val="yellow"/>
-                                    </w:rPr>
-                                    <m:t>A</m:t>
-                                  </m:r>
-                                </m:e>
-                                <m:sub>
-                                  <m:r>
-                                    <w:rPr>
-                                      <w:rFonts w:ascii="Cambria Math" w:hAnsi="Cambria Math"/>
-                                      <w:highlight w:val="yellow"/>
-                                    </w:rPr>
-                                    <m:t>k</m:t>
-                                  </m:r>
-                                </m:sub>
-                              </m:sSub>
-                              <m:r>
-                                <w:rPr>
-                                  <w:rFonts w:ascii="Cambria Math" w:hAnsi="Cambria Math"/>
-                                  <w:highlight w:val="yellow"/>
-                                </w:rPr>
-                                <m:t xml:space="preserve"> </m:t>
-                              </m:r>
-                            </m:oMath>
-                            <w:r>
-                              <w:rPr>
-                                <w:rFonts w:ascii="Cambria Math" w:eastAsiaTheme="minorEastAsia" w:hAnsi="Cambria Math"/>
-                                <w:i/>
-                                <w:highlight w:val="yellow"/>
-                              </w:rPr>
-                              <w:t>qui appartient R</w:t>
-                            </w:r>
-                            <w:proofErr w:type="gramStart"/>
-                            <w:r>
-                              <w:rPr>
-                                <w:rFonts w:ascii="Cambria Math" w:eastAsiaTheme="minorEastAsia" w:hAnsi="Cambria Math"/>
-                                <w:i/>
-                                <w:highlight w:val="yellow"/>
-                              </w:rPr>
-                              <w:t>1</w:t>
-                            </w:r>
-                            <w:r>
-                              <w:rPr>
-                                <w:rFonts w:ascii="Cambria Math" w:eastAsiaTheme="minorEastAsia" w:hAnsi="Cambria Math"/>
-                                <w:i/>
-                                <w:highlight w:val="yellow"/>
-                              </w:rPr>
-                              <w:t xml:space="preserve"> </w:t>
-                            </w:r>
-                            <w:r>
-                              <w:rPr>
-                                <w:rFonts w:ascii="Cambria Math" w:eastAsiaTheme="minorEastAsia" w:hAnsi="Cambria Math"/>
-                                <w:i/>
-                                <w:highlight w:val="yellow"/>
-                              </w:rPr>
-                              <w:t>,</w:t>
-                            </w:r>
-                            <w:proofErr w:type="gramEnd"/>
-                            <w:r>
-                              <w:rPr>
-                                <w:rFonts w:ascii="Cambria Math" w:eastAsiaTheme="minorEastAsia" w:hAnsi="Cambria Math"/>
-                                <w:i/>
-                                <w:highlight w:val="yellow"/>
-                              </w:rPr>
-                              <w:t xml:space="preserve"> c’est-à-dire </w:t>
-                            </w:r>
-                            <w:r>
-                              <w:rPr>
-                                <w:rFonts w:ascii="Cambria Math" w:eastAsiaTheme="minorEastAsia" w:hAnsi="Cambria Math"/>
-                                <w:i/>
-                                <w:highlight w:val="yellow"/>
-                              </w:rPr>
-                              <w:t>O</w:t>
-                            </w:r>
-                            <w:r>
-                              <w:rPr>
-                                <w:rFonts w:ascii="Cambria Math" w:eastAsiaTheme="minorEastAsia" w:hAnsi="Cambria Math"/>
-                                <w:i/>
-                              </w:rPr>
-                              <w:t xml:space="preserve"> </w:t>
-                            </w:r>
-                          </w:p>
-                          <w:p/>
-                        </w:txbxContent>
-                      </wps:txbx>
-                      <wps:bodyPr rot="0" spcFirstLastPara="0" vertOverflow="overflow" horzOverflow="overflow" vert="horz" wrap="square" lIns="91440" tIns="45720" rIns="91440" bIns="45720" numCol="1" spcCol="0" rtlCol="0" fromWordArt="0" anchor="t" anchorCtr="0" forceAA="0" compatLnSpc="1">
-                        <a:prstTxWarp prst="textNoShape">
-                          <a:avLst/>
-                        </a:prstTxWarp>
-                        <a:noAutofit/>
-                      </wps:bodyPr>
-                    </wps:wsp>
-                  </a:graphicData>
-                </a:graphic>
-                <wp14:sizeRelH relativeFrom="margin">
-                  <wp14:pctWidth>0</wp14:pctWidth>
-                </wp14:sizeRelH>
-                <wp14:sizeRelV relativeFrom="margin">
-                  <wp14:pctHeight>0</wp14:pctHeight>
-                </wp14:sizeRelV>
-              </wp:anchor>
-            </w:drawing>
-          </mc:Choice>
-          <mc:Fallback>
-            <w:pict>
-              <v:shape w14:anchorId="5E6B73F4" id="_x0000_s1045" type="#_x0000_t202" style="position:absolute;left:0;text-align:left;margin-left:20.65pt;margin-top:581.5pt;width:165.3pt;height:155.9pt;z-index:251808768;visibility:visible;mso-wrap-style:square;mso-width-percent:0;mso-height-percent:0;mso-wrap-distance-left:9pt;mso-wrap-distance-top:0;mso-wrap-distance-right:9pt;mso-wrap-distance-bottom:0;mso-position-horizontal:absolute;mso-position-horizontal-relative:page;mso-position-vertical:absolute;mso-position-vertical-relative:text;mso-width-percent:0;mso-height-percent:0;mso-width-relative:margin;mso-height-relative:margin;v-text-anchor:top" o:gfxdata="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" fillcolor="white [3201]" strokecolor="#e00" strokeweight="1pt">
-                <v:textbox>
-                  <w:txbxContent>
-                    <w:p>
-                      <w:pPr>
-                        <w:jc w:val="center"/>
-                        <w:rPr>
-                          <w:rFonts w:eastAsiaTheme="minorEastAsia"/>
-                        </w:rPr>
-                      </w:pPr>
-                      <m:oMath>
-                        <m:sSub>
-                          <m:sSubPr>
-                            <m:ctrlPr>
-                              <w:rPr>
-                                <w:rFonts w:ascii="Cambria Math" w:hAnsi="Cambria Math"/>
-                                <w:i/>
-                              </w:rPr>
-                            </m:ctrlPr>
-                          </m:sSubPr>
-                          <m:e>
-                            <m:r>
-                              <w:rPr>
-                                <w:rFonts w:ascii="Cambria Math" w:hAnsi="Cambria Math"/>
-                              </w:rPr>
-                              <m:t>B</m:t>
-                            </m:r>
-                          </m:e>
-                          <m:sub>
-                            <m:r>
-                              <w:rPr>
-                                <w:rFonts w:ascii="Cambria Math" w:hAnsi="Cambria Math"/>
-                              </w:rPr>
-                              <m:t>k</m:t>
-                            </m:r>
-                          </m:sub>
-                        </m:sSub>
-                        <m:r>
-                          <w:rPr>
-                            <w:rFonts w:ascii="Cambria Math" w:hAnsi="Cambria Math"/>
-                          </w:rPr>
-                          <m:t>=</m:t>
-                        </m:r>
-                        <m:r>
-                          <w:rPr>
-                            <w:rFonts w:ascii="Cambria Math" w:hAnsi="Cambria Math"/>
-                          </w:rPr>
-                          <m:t>A</m:t>
-                        </m:r>
-                      </m:oMath>
-                      <w:r>
-                        <w:rPr>
-                          <w:rFonts w:eastAsiaTheme="minorEastAsia"/>
-                        </w:rPr>
-                        <w:t> ;</w:t>
-                      </w:r>
-                    </w:p>
-                    <w:p>
-                      <w:pPr>
-                        <w:jc w:val="center"/>
-                        <w:rPr>
-                          <w:rFonts w:ascii="Cambria Math" w:eastAsiaTheme="minorEastAsia" w:hAnsi="Cambria Math"/>
-                          <w:i/>
-                        </w:rPr>
-                      </w:pPr>
-                      <m:oMathPara>
-                        <m:oMath>
-                          <m:sSub>
-                            <m:sSubPr>
-                              <m:ctrlPr>
-                                <w:rPr>
-                                  <w:rFonts w:ascii="Cambria Math" w:hAnsi="Cambria Math"/>
-                                  <w:i/>
-                                </w:rPr>
-                              </m:ctrlPr>
-                            </m:sSubPr>
-                            <m:e>
-                              <m:r>
-                                <w:rPr>
-                                  <w:rFonts w:ascii="Cambria Math" w:hAnsi="Cambria Math"/>
-                                </w:rPr>
-                                <m:t>A</m:t>
-                              </m:r>
-                            </m:e>
-                            <m:sub>
-                              <m:r>
-                                <w:rPr>
-                                  <w:rFonts w:ascii="Cambria Math" w:hAnsi="Cambria Math"/>
-                                </w:rPr>
-                                <m:t>k</m:t>
-                              </m:r>
-                            </m:sub>
-                          </m:sSub>
-                          <m:r>
-                            <w:rPr>
-                              <w:rFonts w:ascii="Cambria Math" w:hAnsi="Cambria Math"/>
-                            </w:rPr>
-                            <m:t>=</m:t>
-                          </m:r>
-                          <m:r>
-                            <w:rPr>
-                              <w:rFonts w:ascii="Cambria Math" w:hAnsi="Cambria Math"/>
-                            </w:rPr>
-                            <m:t>O</m:t>
-                          </m:r>
-                        </m:oMath>
-                      </m:oMathPara>
-                    </w:p>
-                    <w:p>
-                      <w:pPr>
-                        <w:jc w:val="center"/>
-                      </w:pPr>
-                      <w:r>
-                        <w:rPr>
-                          <w:rFonts w:ascii="Cambria Math" w:eastAsiaTheme="minorEastAsia" w:hAnsi="Cambria Math"/>
-                          <w:i/>
-                          <w:highlight w:val="yellow"/>
-                        </w:rPr>
-                        <w:t xml:space="preserve">C’est-à-dire point appartient repère k dont notre cas </w:t>
-                      </w:r>
-                      <w:r>
-                        <w:rPr>
-                          <w:rFonts w:ascii="Cambria Math" w:eastAsiaTheme="minorEastAsia" w:hAnsi="Cambria Math"/>
-                          <w:i/>
-                          <w:highlight w:val="yellow"/>
-                        </w:rPr>
-                        <w:t>A</w:t>
-                      </w:r>
-                      <w:r>
-                        <w:rPr>
-                          <w:rFonts w:ascii="Cambria Math" w:eastAsiaTheme="minorEastAsia" w:hAnsi="Cambria Math"/>
-                          <w:i/>
-                          <w:highlight w:val="yellow"/>
-                        </w:rPr>
-                        <w:t xml:space="preserve"> appartient R</w:t>
-                      </w:r>
-                      <w:r>
-                        <w:rPr>
-                          <w:rFonts w:ascii="Cambria Math" w:eastAsiaTheme="minorEastAsia" w:hAnsi="Cambria Math"/>
-                          <w:i/>
-                          <w:highlight w:val="yellow"/>
-                        </w:rPr>
-                        <w:t>1</w:t>
-                      </w:r>
-                      <w:r>
-                        <w:rPr>
-                          <w:rFonts w:ascii="Cambria Math" w:eastAsiaTheme="minorEastAsia" w:hAnsi="Cambria Math"/>
-                          <w:i/>
-                          <w:highlight w:val="yellow"/>
-                        </w:rPr>
-                        <w:t xml:space="preserve"> donc k=</w:t>
-                      </w:r>
-                      <w:r>
-                        <w:rPr>
-                          <w:rFonts w:ascii="Cambria Math" w:eastAsiaTheme="minorEastAsia" w:hAnsi="Cambria Math"/>
-                          <w:i/>
-                          <w:highlight w:val="yellow"/>
-                        </w:rPr>
-                        <w:t>1</w:t>
-                      </w:r>
-                      <w:r>
-                        <w:rPr>
-                          <w:rFonts w:ascii="Cambria Math" w:eastAsiaTheme="minorEastAsia" w:hAnsi="Cambria Math"/>
-                          <w:i/>
-                          <w:highlight w:val="yellow"/>
-                        </w:rPr>
-                        <w:t xml:space="preserve"> et on ne cherche point </w:t>
-                      </w:r>
-                      <m:oMath>
-                        <m:sSub>
-                          <m:sSubPr>
-                            <m:ctrlPr>
-                              <w:rPr>
-                                <w:rFonts w:ascii="Cambria Math" w:hAnsi="Cambria Math"/>
-                                <w:i/>
-                                <w:highlight w:val="yellow"/>
-                              </w:rPr>
-                            </m:ctrlPr>
-                          </m:sSubPr>
-                          <m:e>
-                            <m:r>
-                              <w:rPr>
-                                <w:rFonts w:ascii="Cambria Math" w:hAnsi="Cambria Math"/>
-                                <w:highlight w:val="yellow"/>
-                              </w:rPr>
-                              <m:t>A</m:t>
-                            </m:r>
-                          </m:e>
-                          <m:sub>
-                            <m:r>
-                              <w:rPr>
-                                <w:rFonts w:ascii="Cambria Math" w:hAnsi="Cambria Math"/>
-                                <w:highlight w:val="yellow"/>
-                              </w:rPr>
-                              <m:t>k</m:t>
-                            </m:r>
-                          </m:sub>
-                        </m:sSub>
-                        <m:r>
-                          <w:rPr>
-                            <w:rFonts w:ascii="Cambria Math" w:hAnsi="Cambria Math"/>
-                            <w:highlight w:val="yellow"/>
-                          </w:rPr>
-                          <m:t xml:space="preserve"> </m:t>
-                        </m:r>
-                      </m:oMath>
-                      <w:r>
-                        <w:rPr>
-                          <w:rFonts w:ascii="Cambria Math" w:eastAsiaTheme="minorEastAsia" w:hAnsi="Cambria Math"/>
-                          <w:i/>
-                          <w:highlight w:val="yellow"/>
-                        </w:rPr>
-                        <w:t>qui appartient R</w:t>
-                      </w:r>
-                      <w:proofErr w:type="gramStart"/>
-                      <w:r>
-                        <w:rPr>
-                          <w:rFonts w:ascii="Cambria Math" w:eastAsiaTheme="minorEastAsia" w:hAnsi="Cambria Math"/>
-                          <w:i/>
-                          <w:highlight w:val="yellow"/>
-                        </w:rPr>
-                        <w:t>1</w:t>
-                      </w:r>
-                      <w:r>
-                        <w:rPr>
-                          <w:rFonts w:ascii="Cambria Math" w:eastAsiaTheme="minorEastAsia" w:hAnsi="Cambria Math"/>
-                          <w:i/>
-                          <w:highlight w:val="yellow"/>
-                        </w:rPr>
-                        <w:t xml:space="preserve"> </w:t>
-                      </w:r>
-                      <w:r>
-                        <w:rPr>
-                          <w:rFonts w:ascii="Cambria Math" w:eastAsiaTheme="minorEastAsia" w:hAnsi="Cambria Math"/>
-                          <w:i/>
-                          <w:highlight w:val="yellow"/>
-                        </w:rPr>
-                        <w:t>,</w:t>
-                      </w:r>
-                      <w:proofErr w:type="gramEnd"/>
-                      <w:r>
-                        <w:rPr>
-                          <w:rFonts w:ascii="Cambria Math" w:eastAsiaTheme="minorEastAsia" w:hAnsi="Cambria Math"/>
-                          <w:i/>
-                          <w:highlight w:val="yellow"/>
-                        </w:rPr>
-                        <w:t xml:space="preserve"> c’est-à-dire </w:t>
-                      </w:r>
-                      <w:r>
-                        <w:rPr>
-                          <w:rFonts w:ascii="Cambria Math" w:eastAsiaTheme="minorEastAsia" w:hAnsi="Cambria Math"/>
-                          <w:i/>
-                          <w:highlight w:val="yellow"/>
-                        </w:rPr>
-                        <w:t>O</w:t>
-                      </w:r>
-                      <w:r>
-                        <w:rPr>
-                          <w:rFonts w:ascii="Cambria Math" w:eastAsiaTheme="minorEastAsia" w:hAnsi="Cambria Math"/>
-                          <w:i/>
-                        </w:rPr>
-                        <w:t xml:space="preserve"> </w:t>
-                      </w:r>
-                    </w:p>
-                    <w:p/>
-                  </w:txbxContent>
-                </v:textbox>
-                <w10:wrap anchorx="page"/>
-              </v:shape>
-            </w:pict>
-          </mc:Fallback>
-        </mc:AlternateContent>
-      </w:r>
-      <w:r>
-        <w:rPr>
-          <w:noProof/>
-        </w:rPr>
-        <mc:AlternateContent>
-          <mc:Choice Requires="wps">
-            <w:drawing>
-              <wp:anchor distT="0" distB="0" distL="114300" distR="114300" simplePos="0" relativeHeight="251805696" behindDoc="0" locked="0" layoutInCell="1" allowOverlap="1" wp14:anchorId="47AD4C23" wp14:editId="78ABDD5C">
-                <wp:simplePos x="0" y="0"/>
-                <wp:positionH relativeFrom="page">
-                  <wp:posOffset>5406887</wp:posOffset>
-                </wp:positionH>
-                <wp:positionV relativeFrom="paragraph">
-                  <wp:posOffset>5123180</wp:posOffset>
-                </wp:positionV>
-                <wp:extent cx="2003425" cy="1896138"/>
-                <wp:effectExtent l="0" t="0" r="15875" b="27940"/>
-                <wp:wrapNone/>
-                <wp:docPr id="1445852579" name="Zone de texte 26"/>
-                <wp:cNvGraphicFramePr/>
-                <a:graphic xmlns:a="http://schemas.openxmlformats.org/drawingml/2006/main">
-                  <a:graphicData uri="http://schemas.microsoft.com/office/word/2010/wordprocessingShape">
-                    <wps:wsp>
-                      <wps:cNvSpPr txBox="1"/>
-                      <wps:spPr>
-                        <a:xfrm>
-                          <a:off x="0" y="0"/>
-                          <a:ext cx="2003425" cy="1896138"/>
-                        </a:xfrm>
-                        <a:prstGeom prst="rect">
-                          <a:avLst/>
-                        </a:prstGeom>
-                        <a:ln>
-                          <a:solidFill>
-                            <a:srgbClr val="EE0000"/>
-                          </a:solidFill>
-                        </a:ln>
-                      </wps:spPr>
-                      <wps:style>
-                        <a:lnRef idx="2">
-                          <a:schemeClr val="accent2"/>
-                        </a:lnRef>
-                        <a:fillRef idx="1">
-                          <a:schemeClr val="lt1"/>
-                        </a:fillRef>
-                        <a:effectRef idx="0">
-                          <a:schemeClr val="accent2"/>
-                        </a:effectRef>
-                        <a:fontRef idx="minor">
-                          <a:schemeClr val="dk1"/>
-                        </a:fontRef>
-                      </wps:style>
-                      <wps:txbx>
-                        <w:txbxContent>
-                          <w:p>
-                            <w:pPr>
+                              <w:spacing w:after="0"/>
                               <w:jc w:val="center"/>
                               <w:rPr>
                                 <w:rFonts w:ascii="Cambria Math" w:eastAsiaTheme="minorEastAsia" w:hAnsi="Cambria Math"/>
@@ -7468,11 +6780,12 @@
           </mc:Choice>
           <mc:Fallback>
             <w:pict>
-              <v:shape w14:anchorId="47AD4C23" id="_x0000_s1046" type="#_x0000_t202" style="position:absolute;left:0;text-align:left;margin-left:425.75pt;margin-top:403.4pt;width:157.75pt;height:149.3pt;z-index:251805696;visibility:visible;mso-wrap-style:square;mso-width-percent:0;mso-height-percent:0;mso-wrap-distance-left:9pt;mso-wrap-distance-top:0;mso-wrap-distance-right:9pt;mso-wrap-distance-bottom:0;mso-position-horizontal:absolute;mso-position-horizontal-relative:page;mso-position-vertical:absolute;mso-position-vertical-relative:text;mso-width-percent:0;mso-height-percent:0;mso-width-relative:margin;mso-height-relative:margin;v-text-anchor:top" o:gfxdata="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" fillcolor="white [3201]" strokecolor="#e00" strokeweight="1pt">
+              <v:shape w14:anchorId="47AD4C23" id="_x0000_s1045" type="#_x0000_t202" style="position:absolute;left:0;text-align:left;margin-left:115.3pt;margin-top:403.7pt;width:166.5pt;height:130.85pt;z-index:251805696;visibility:visible;mso-wrap-style:square;mso-width-percent:0;mso-height-percent:0;mso-wrap-distance-left:9pt;mso-wrap-distance-top:0;mso-wrap-distance-right:9pt;mso-wrap-distance-bottom:0;mso-position-horizontal:right;mso-position-horizontal-relative:page;mso-position-vertical:absolute;mso-position-vertical-relative:text;mso-width-percent:0;mso-height-percent:0;mso-width-relative:margin;mso-height-relative:margin;v-text-anchor:top" o:gfxdata="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" fillcolor="white [3201]" strokecolor="#e00" strokeweight="1pt">
                 <v:textbox>
                   <w:txbxContent>
                     <w:p>
                       <w:pPr>
+                        <w:spacing w:after="0"/>
                         <w:jc w:val="center"/>
                         <w:rPr>
                           <w:rFonts w:ascii="Cambria Math" w:eastAsiaTheme="minorEastAsia" w:hAnsi="Cambria Math"/>
@@ -7668,6 +6981,699 @@
                           <w:highlight w:val="yellow"/>
                         </w:rPr>
                         <w:t>A</w:t>
+                      </w:r>
+                      <w:r>
+                        <w:rPr>
+                          <w:rFonts w:ascii="Cambria Math" w:eastAsiaTheme="minorEastAsia" w:hAnsi="Cambria Math"/>
+                          <w:i/>
+                        </w:rPr>
+                        <w:t xml:space="preserve"> </w:t>
+                      </w:r>
+                    </w:p>
+                    <w:p/>
+                  </w:txbxContent>
+                </v:textbox>
+                <w10:wrap anchorx="page"/>
+              </v:shape>
+            </w:pict>
+          </mc:Fallback>
+        </mc:AlternateContent>
+      </w:r>
+      <w:r>
+        <w:rPr>
+          <w:noProof/>
+        </w:rPr>
+        <mc:AlternateContent>
+          <mc:Choice Requires="wps">
+            <w:drawing>
+              <wp:anchor distT="0" distB="0" distL="114300" distR="114300" simplePos="0" relativeHeight="251810816" behindDoc="0" locked="0" layoutInCell="1" allowOverlap="1" wp14:anchorId="1266F3F0" wp14:editId="5EE5488E">
+                <wp:simplePos x="0" y="0"/>
+                <wp:positionH relativeFrom="leftMargin">
+                  <wp:align>right</wp:align>
+                </wp:positionH>
+                <wp:positionV relativeFrom="paragraph">
+                  <wp:posOffset>5453104</wp:posOffset>
+                </wp:positionV>
+                <wp:extent cx="532737" cy="1913338"/>
+                <wp:effectExtent l="0" t="76200" r="0" b="29845"/>
+                <wp:wrapNone/>
+                <wp:docPr id="2137952318" name="Connecteur : en angle 27"/>
+                <wp:cNvGraphicFramePr/>
+                <a:graphic xmlns:a="http://schemas.openxmlformats.org/drawingml/2006/main">
+                  <a:graphicData uri="http://schemas.microsoft.com/office/word/2010/wordprocessingShape">
+                    <wps:wsp>
+                      <wps:cNvCnPr/>
+                      <wps:spPr>
+                        <a:xfrm flipV="1">
+                          <a:off x="0" y="0"/>
+                          <a:ext cx="532737" cy="1913338"/>
+                        </a:xfrm>
+                        <a:prstGeom prst="bentConnector3">
+                          <a:avLst>
+                            <a:gd name="adj1" fmla="val 32615"/>
+                          </a:avLst>
+                        </a:prstGeom>
+                        <a:ln>
+                          <a:solidFill>
+                            <a:srgbClr val="EE0000"/>
+                          </a:solidFill>
+                          <a:tailEnd type="triangle"/>
+                        </a:ln>
+                      </wps:spPr>
+                      <wps:style>
+                        <a:lnRef idx="1">
+                          <a:schemeClr val="accent1"/>
+                        </a:lnRef>
+                        <a:fillRef idx="0">
+                          <a:schemeClr val="accent1"/>
+                        </a:fillRef>
+                        <a:effectRef idx="0">
+                          <a:schemeClr val="accent1"/>
+                        </a:effectRef>
+                        <a:fontRef idx="minor">
+                          <a:schemeClr val="tx1"/>
+                        </a:fontRef>
+                      </wps:style>
+                      <wps:bodyPr/>
+                    </wps:wsp>
+                  </a:graphicData>
+                </a:graphic>
+                <wp14:sizeRelH relativeFrom="margin">
+                  <wp14:pctWidth>0</wp14:pctWidth>
+                </wp14:sizeRelH>
+                <wp14:sizeRelV relativeFrom="margin">
+                  <wp14:pctHeight>0</wp14:pctHeight>
+                </wp14:sizeRelV>
+              </wp:anchor>
+            </w:drawing>
+          </mc:Choice>
+          <mc:Fallback>
+            <w:pict>
+              <v:shape w14:anchorId="524CE2B4" id="Connecteur : en angle 27" o:spid="_x0000_s1026" type="#_x0000_t34" style="position:absolute;margin-left:-9.25pt;margin-top:429.4pt;width:41.95pt;height:150.65pt;flip:y;z-index:251810816;visibility:visible;mso-wrap-style:square;mso-width-percent:0;mso-height-percent:0;mso-wrap-distance-left:9pt;mso-wrap-distance-top:0;mso-wrap-distance-right:9pt;mso-wrap-distance-bottom:0;mso-position-horizontal:right;mso-position-horizontal-relative:left-margin-area;mso-position-vertical:absolute;mso-position-vertical-relative:text;mso-width-percent:0;mso-height-percent:0;mso-width-relative:margin;mso-height-relative:margin" o:gfxdata="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" adj="7045" strokecolor="#e00" strokeweight=".5pt">
+                <v:stroke endarrow="block"/>
+                <w10:wrap anchorx="margin"/>
+              </v:shape>
+            </w:pict>
+          </mc:Fallback>
+        </mc:AlternateContent>
+      </w:r>
+      <w:r>
+        <w:rPr>
+          <w:noProof/>
+        </w:rPr>
+        <mc:AlternateContent>
+          <mc:Choice Requires="wps">
+            <w:drawing>
+              <wp:anchor distT="0" distB="0" distL="114300" distR="114300" simplePos="0" relativeHeight="251808768" behindDoc="0" locked="0" layoutInCell="1" allowOverlap="1" wp14:anchorId="5E6B73F4" wp14:editId="50251691">
+                <wp:simplePos x="0" y="0"/>
+                <wp:positionH relativeFrom="page">
+                  <wp:posOffset>262393</wp:posOffset>
+                </wp:positionH>
+                <wp:positionV relativeFrom="paragraph">
+                  <wp:posOffset>7385270</wp:posOffset>
+                </wp:positionV>
+                <wp:extent cx="2099144" cy="1979875"/>
+                <wp:effectExtent l="0" t="0" r="15875" b="20955"/>
+                <wp:wrapNone/>
+                <wp:docPr id="886192443" name="Zone de texte 26"/>
+                <wp:cNvGraphicFramePr/>
+                <a:graphic xmlns:a="http://schemas.openxmlformats.org/drawingml/2006/main">
+                  <a:graphicData uri="http://schemas.microsoft.com/office/word/2010/wordprocessingShape">
+                    <wps:wsp>
+                      <wps:cNvSpPr txBox="1"/>
+                      <wps:spPr>
+                        <a:xfrm>
+                          <a:off x="0" y="0"/>
+                          <a:ext cx="2099144" cy="1979875"/>
+                        </a:xfrm>
+                        <a:prstGeom prst="rect">
+                          <a:avLst/>
+                        </a:prstGeom>
+                        <a:ln>
+                          <a:solidFill>
+                            <a:srgbClr val="EE0000"/>
+                          </a:solidFill>
+                        </a:ln>
+                      </wps:spPr>
+                      <wps:style>
+                        <a:lnRef idx="2">
+                          <a:schemeClr val="accent2"/>
+                        </a:lnRef>
+                        <a:fillRef idx="1">
+                          <a:schemeClr val="lt1"/>
+                        </a:fillRef>
+                        <a:effectRef idx="0">
+                          <a:schemeClr val="accent2"/>
+                        </a:effectRef>
+                        <a:fontRef idx="minor">
+                          <a:schemeClr val="dk1"/>
+                        </a:fontRef>
+                      </wps:style>
+                      <wps:txbx>
+                        <w:txbxContent>
+                          <w:p>
+                            <w:pPr>
+                              <w:spacing w:after="0" w:line="240" w:lineRule="auto"/>
+                              <w:jc w:val="center"/>
+                              <w:rPr>
+                                <w:rFonts w:eastAsiaTheme="minorEastAsia"/>
+                              </w:rPr>
+                            </w:pPr>
+                            <m:oMath>
+                              <m:sSub>
+                                <m:sSubPr>
+                                  <m:ctrlPr>
+                                    <w:rPr>
+                                      <w:rFonts w:ascii="Cambria Math" w:hAnsi="Cambria Math"/>
+                                      <w:i/>
+                                    </w:rPr>
+                                  </m:ctrlPr>
+                                </m:sSubPr>
+                                <m:e>
+                                  <m:r>
+                                    <w:rPr>
+                                      <w:rFonts w:ascii="Cambria Math" w:hAnsi="Cambria Math"/>
+                                    </w:rPr>
+                                    <m:t>B</m:t>
+                                  </m:r>
+                                </m:e>
+                                <m:sub>
+                                  <m:r>
+                                    <w:rPr>
+                                      <w:rFonts w:ascii="Cambria Math" w:hAnsi="Cambria Math"/>
+                                    </w:rPr>
+                                    <m:t>k</m:t>
+                                  </m:r>
+                                </m:sub>
+                              </m:sSub>
+                              <m:r>
+                                <w:rPr>
+                                  <w:rFonts w:ascii="Cambria Math" w:hAnsi="Cambria Math"/>
+                                </w:rPr>
+                                <m:t>=</m:t>
+                              </m:r>
+                              <m:r>
+                                <w:rPr>
+                                  <w:rFonts w:ascii="Cambria Math" w:hAnsi="Cambria Math"/>
+                                </w:rPr>
+                                <m:t>A</m:t>
+                              </m:r>
+                            </m:oMath>
+                            <w:r>
+                              <w:rPr>
+                                <w:rFonts w:eastAsiaTheme="minorEastAsia"/>
+                              </w:rPr>
+                              <w:t> ;</w:t>
+                            </w:r>
+                          </w:p>
+                          <w:p>
+                            <w:pPr>
+                              <w:spacing w:after="0" w:line="240" w:lineRule="auto"/>
+                              <w:jc w:val="center"/>
+                              <w:rPr>
+                                <w:rFonts w:ascii="Cambria Math" w:eastAsiaTheme="minorEastAsia" w:hAnsi="Cambria Math"/>
+                                <w:i/>
+                              </w:rPr>
+                            </w:pPr>
+                            <m:oMathPara>
+                              <m:oMath>
+                                <m:sSub>
+                                  <m:sSubPr>
+                                    <m:ctrlPr>
+                                      <w:rPr>
+                                        <w:rFonts w:ascii="Cambria Math" w:hAnsi="Cambria Math"/>
+                                        <w:i/>
+                                      </w:rPr>
+                                    </m:ctrlPr>
+                                  </m:sSubPr>
+                                  <m:e>
+                                    <m:r>
+                                      <w:rPr>
+                                        <w:rFonts w:ascii="Cambria Math" w:hAnsi="Cambria Math"/>
+                                      </w:rPr>
+                                      <m:t>A</m:t>
+                                    </m:r>
+                                  </m:e>
+                                  <m:sub>
+                                    <m:r>
+                                      <w:rPr>
+                                        <w:rFonts w:ascii="Cambria Math" w:hAnsi="Cambria Math"/>
+                                      </w:rPr>
+                                      <m:t>k</m:t>
+                                    </m:r>
+                                  </m:sub>
+                                </m:sSub>
+                                <m:r>
+                                  <w:rPr>
+                                    <w:rFonts w:ascii="Cambria Math" w:hAnsi="Cambria Math"/>
+                                  </w:rPr>
+                                  <m:t>=</m:t>
+                                </m:r>
+                                <m:r>
+                                  <w:rPr>
+                                    <w:rFonts w:ascii="Cambria Math" w:hAnsi="Cambria Math"/>
+                                  </w:rPr>
+                                  <m:t>O</m:t>
+                                </m:r>
+                              </m:oMath>
+                            </m:oMathPara>
+                          </w:p>
+                          <w:p>
+                            <w:pPr>
+                              <w:jc w:val="both"/>
+                            </w:pPr>
+                            <w:r>
+                              <w:rPr>
+                                <w:rFonts w:ascii="Cambria Math" w:eastAsiaTheme="minorEastAsia" w:hAnsi="Cambria Math"/>
+                                <w:i/>
+                                <w:highlight w:val="yellow"/>
+                              </w:rPr>
+                              <w:t xml:space="preserve">C’est-à-dire point appartient repère k dont notre cas </w:t>
+                            </w:r>
+                            <w:r>
+                              <w:rPr>
+                                <w:rFonts w:ascii="Cambria Math" w:eastAsiaTheme="minorEastAsia" w:hAnsi="Cambria Math"/>
+                                <w:i/>
+                                <w:highlight w:val="yellow"/>
+                              </w:rPr>
+                              <w:t>A</w:t>
+                            </w:r>
+                            <w:r>
+                              <w:rPr>
+                                <w:rFonts w:ascii="Cambria Math" w:eastAsiaTheme="minorEastAsia" w:hAnsi="Cambria Math"/>
+                                <w:i/>
+                                <w:highlight w:val="yellow"/>
+                              </w:rPr>
+                              <w:t xml:space="preserve"> appartient R</w:t>
+                            </w:r>
+                            <w:r>
+                              <w:rPr>
+                                <w:rFonts w:ascii="Cambria Math" w:eastAsiaTheme="minorEastAsia" w:hAnsi="Cambria Math"/>
+                                <w:i/>
+                                <w:highlight w:val="yellow"/>
+                              </w:rPr>
+                              <w:t>1</w:t>
+                            </w:r>
+                            <w:r>
+                              <w:rPr>
+                                <w:rFonts w:ascii="Cambria Math" w:eastAsiaTheme="minorEastAsia" w:hAnsi="Cambria Math"/>
+                                <w:i/>
+                                <w:highlight w:val="yellow"/>
+                              </w:rPr>
+                              <w:t xml:space="preserve"> donc k=</w:t>
+                            </w:r>
+                            <w:r>
+                              <w:rPr>
+                                <w:rFonts w:ascii="Cambria Math" w:eastAsiaTheme="minorEastAsia" w:hAnsi="Cambria Math"/>
+                                <w:i/>
+                                <w:highlight w:val="yellow"/>
+                              </w:rPr>
+                              <w:t>1</w:t>
+                            </w:r>
+                            <w:r>
+                              <w:rPr>
+                                <w:rFonts w:ascii="Cambria Math" w:eastAsiaTheme="minorEastAsia" w:hAnsi="Cambria Math"/>
+                                <w:i/>
+                                <w:highlight w:val="yellow"/>
+                              </w:rPr>
+                              <w:t xml:space="preserve"> et on ne cherche point </w:t>
+                            </w:r>
+                            <m:oMath>
+                              <m:sSub>
+                                <m:sSubPr>
+                                  <m:ctrlPr>
+                                    <w:rPr>
+                                      <w:rFonts w:ascii="Cambria Math" w:hAnsi="Cambria Math"/>
+                                      <w:i/>
+                                      <w:highlight w:val="yellow"/>
+                                    </w:rPr>
+                                  </m:ctrlPr>
+                                </m:sSubPr>
+                                <m:e>
+                                  <m:r>
+                                    <w:rPr>
+                                      <w:rFonts w:ascii="Cambria Math" w:hAnsi="Cambria Math"/>
+                                      <w:highlight w:val="yellow"/>
+                                    </w:rPr>
+                                    <m:t>A</m:t>
+                                  </m:r>
+                                </m:e>
+                                <m:sub>
+                                  <m:r>
+                                    <w:rPr>
+                                      <w:rFonts w:ascii="Cambria Math" w:hAnsi="Cambria Math"/>
+                                      <w:highlight w:val="yellow"/>
+                                    </w:rPr>
+                                    <m:t>k</m:t>
+                                  </m:r>
+                                </m:sub>
+                              </m:sSub>
+                              <m:r>
+                                <w:rPr>
+                                  <w:rFonts w:ascii="Cambria Math" w:hAnsi="Cambria Math"/>
+                                  <w:highlight w:val="yellow"/>
+                                </w:rPr>
+                                <m:t xml:space="preserve"> </m:t>
+                              </m:r>
+                            </m:oMath>
+                            <w:r>
+                              <w:rPr>
+                                <w:rFonts w:ascii="Cambria Math" w:eastAsiaTheme="minorEastAsia" w:hAnsi="Cambria Math"/>
+                                <w:i/>
+                                <w:highlight w:val="yellow"/>
+                              </w:rPr>
+                              <w:t>qui appartient R</w:t>
+                            </w:r>
+                            <w:proofErr w:type="gramStart"/>
+                            <w:r>
+                              <w:rPr>
+                                <w:rFonts w:ascii="Cambria Math" w:eastAsiaTheme="minorEastAsia" w:hAnsi="Cambria Math"/>
+                                <w:i/>
+                                <w:highlight w:val="yellow"/>
+                              </w:rPr>
+                              <w:t>1</w:t>
+                            </w:r>
+                            <w:r>
+                              <w:rPr>
+                                <w:rFonts w:ascii="Cambria Math" w:eastAsiaTheme="minorEastAsia" w:hAnsi="Cambria Math"/>
+                                <w:i/>
+                                <w:highlight w:val="yellow"/>
+                              </w:rPr>
+                              <w:t xml:space="preserve"> </w:t>
+                            </w:r>
+                            <w:r>
+                              <w:rPr>
+                                <w:rFonts w:ascii="Cambria Math" w:eastAsiaTheme="minorEastAsia" w:hAnsi="Cambria Math"/>
+                                <w:i/>
+                                <w:highlight w:val="yellow"/>
+                              </w:rPr>
+                              <w:t>,</w:t>
+                            </w:r>
+                            <w:proofErr w:type="gramEnd"/>
+                            <w:r>
+                              <w:rPr>
+                                <w:rFonts w:ascii="Cambria Math" w:eastAsiaTheme="minorEastAsia" w:hAnsi="Cambria Math"/>
+                                <w:i/>
+                                <w:highlight w:val="yellow"/>
+                              </w:rPr>
+                              <w:t xml:space="preserve"> c’est-à-dire </w:t>
+                            </w:r>
+                            <w:r>
+                              <w:rPr>
+                                <w:rFonts w:ascii="Cambria Math" w:eastAsiaTheme="minorEastAsia" w:hAnsi="Cambria Math"/>
+                                <w:i/>
+                                <w:highlight w:val="yellow"/>
+                              </w:rPr>
+                              <w:t>O</w:t>
+                            </w:r>
+                            <w:r>
+                              <w:rPr>
+                                <w:rFonts w:ascii="Cambria Math" w:eastAsiaTheme="minorEastAsia" w:hAnsi="Cambria Math"/>
+                                <w:i/>
+                              </w:rPr>
+                              <w:t xml:space="preserve"> </w:t>
+                            </w:r>
+                          </w:p>
+                          <w:p/>
+                        </w:txbxContent>
+                      </wps:txbx>
+                      <wps:bodyPr rot="0" spcFirstLastPara="0" vertOverflow="overflow" horzOverflow="overflow" vert="horz" wrap="square" lIns="91440" tIns="45720" rIns="91440" bIns="45720" numCol="1" spcCol="0" rtlCol="0" fromWordArt="0" anchor="t" anchorCtr="0" forceAA="0" compatLnSpc="1">
+                        <a:prstTxWarp prst="textNoShape">
+                          <a:avLst/>
+                        </a:prstTxWarp>
+                        <a:noAutofit/>
+                      </wps:bodyPr>
+                    </wps:wsp>
+                  </a:graphicData>
+                </a:graphic>
+                <wp14:sizeRelH relativeFrom="margin">
+                  <wp14:pctWidth>0</wp14:pctWidth>
+                </wp14:sizeRelH>
+                <wp14:sizeRelV relativeFrom="margin">
+                  <wp14:pctHeight>0</wp14:pctHeight>
+                </wp14:sizeRelV>
+              </wp:anchor>
+            </w:drawing>
+          </mc:Choice>
+          <mc:Fallback>
+            <w:pict>
+              <v:shape w14:anchorId="5E6B73F4" id="_x0000_s1046" type="#_x0000_t202" style="position:absolute;left:0;text-align:left;margin-left:20.65pt;margin-top:581.5pt;width:165.3pt;height:155.9pt;z-index:251808768;visibility:visible;mso-wrap-style:square;mso-width-percent:0;mso-height-percent:0;mso-wrap-distance-left:9pt;mso-wrap-distance-top:0;mso-wrap-distance-right:9pt;mso-wrap-distance-bottom:0;mso-position-horizontal:absolute;mso-position-horizontal-relative:page;mso-position-vertical:absolute;mso-position-vertical-relative:text;mso-width-percent:0;mso-height-percent:0;mso-width-relative:margin;mso-height-relative:margin;v-text-anchor:top" o:gfxdata="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" fillcolor="white [3201]" strokecolor="#e00" strokeweight="1pt">
+                <v:textbox>
+                  <w:txbxContent>
+                    <w:p>
+                      <w:pPr>
+                        <w:spacing w:after="0" w:line="240" w:lineRule="auto"/>
+                        <w:jc w:val="center"/>
+                        <w:rPr>
+                          <w:rFonts w:eastAsiaTheme="minorEastAsia"/>
+                        </w:rPr>
+                      </w:pPr>
+                      <m:oMath>
+                        <m:sSub>
+                          <m:sSubPr>
+                            <m:ctrlPr>
+                              <w:rPr>
+                                <w:rFonts w:ascii="Cambria Math" w:hAnsi="Cambria Math"/>
+                                <w:i/>
+                              </w:rPr>
+                            </m:ctrlPr>
+                          </m:sSubPr>
+                          <m:e>
+                            <m:r>
+                              <w:rPr>
+                                <w:rFonts w:ascii="Cambria Math" w:hAnsi="Cambria Math"/>
+                              </w:rPr>
+                              <m:t>B</m:t>
+                            </m:r>
+                          </m:e>
+                          <m:sub>
+                            <m:r>
+                              <w:rPr>
+                                <w:rFonts w:ascii="Cambria Math" w:hAnsi="Cambria Math"/>
+                              </w:rPr>
+                              <m:t>k</m:t>
+                            </m:r>
+                          </m:sub>
+                        </m:sSub>
+                        <m:r>
+                          <w:rPr>
+                            <w:rFonts w:ascii="Cambria Math" w:hAnsi="Cambria Math"/>
+                          </w:rPr>
+                          <m:t>=</m:t>
+                        </m:r>
+                        <m:r>
+                          <w:rPr>
+                            <w:rFonts w:ascii="Cambria Math" w:hAnsi="Cambria Math"/>
+                          </w:rPr>
+                          <m:t>A</m:t>
+                        </m:r>
+                      </m:oMath>
+                      <w:r>
+                        <w:rPr>
+                          <w:rFonts w:eastAsiaTheme="minorEastAsia"/>
+                        </w:rPr>
+                        <w:t> ;</w:t>
+                      </w:r>
+                    </w:p>
+                    <w:p>
+                      <w:pPr>
+                        <w:spacing w:after="0" w:line="240" w:lineRule="auto"/>
+                        <w:jc w:val="center"/>
+                        <w:rPr>
+                          <w:rFonts w:ascii="Cambria Math" w:eastAsiaTheme="minorEastAsia" w:hAnsi="Cambria Math"/>
+                          <w:i/>
+                        </w:rPr>
+                      </w:pPr>
+                      <m:oMathPara>
+                        <m:oMath>
+                          <m:sSub>
+                            <m:sSubPr>
+                              <m:ctrlPr>
+                                <w:rPr>
+                                  <w:rFonts w:ascii="Cambria Math" w:hAnsi="Cambria Math"/>
+                                  <w:i/>
+                                </w:rPr>
+                              </m:ctrlPr>
+                            </m:sSubPr>
+                            <m:e>
+                              <m:r>
+                                <w:rPr>
+                                  <w:rFonts w:ascii="Cambria Math" w:hAnsi="Cambria Math"/>
+                                </w:rPr>
+                                <m:t>A</m:t>
+                              </m:r>
+                            </m:e>
+                            <m:sub>
+                              <m:r>
+                                <w:rPr>
+                                  <w:rFonts w:ascii="Cambria Math" w:hAnsi="Cambria Math"/>
+                                </w:rPr>
+                                <m:t>k</m:t>
+                              </m:r>
+                            </m:sub>
+                          </m:sSub>
+                          <m:r>
+                            <w:rPr>
+                              <w:rFonts w:ascii="Cambria Math" w:hAnsi="Cambria Math"/>
+                            </w:rPr>
+                            <m:t>=</m:t>
+                          </m:r>
+                          <m:r>
+                            <w:rPr>
+                              <w:rFonts w:ascii="Cambria Math" w:hAnsi="Cambria Math"/>
+                            </w:rPr>
+                            <m:t>O</m:t>
+                          </m:r>
+                        </m:oMath>
+                      </m:oMathPara>
+                    </w:p>
+                    <w:p>
+                      <w:pPr>
+                        <w:jc w:val="both"/>
+                      </w:pPr>
+                      <w:r>
+                        <w:rPr>
+                          <w:rFonts w:ascii="Cambria Math" w:eastAsiaTheme="minorEastAsia" w:hAnsi="Cambria Math"/>
+                          <w:i/>
+                          <w:highlight w:val="yellow"/>
+                        </w:rPr>
+                        <w:t xml:space="preserve">C’est-à-dire point appartient repère k dont notre cas </w:t>
+                      </w:r>
+                      <w:r>
+                        <w:rPr>
+                          <w:rFonts w:ascii="Cambria Math" w:eastAsiaTheme="minorEastAsia" w:hAnsi="Cambria Math"/>
+                          <w:i/>
+                          <w:highlight w:val="yellow"/>
+                        </w:rPr>
+                        <w:t>A</w:t>
+                      </w:r>
+                      <w:r>
+                        <w:rPr>
+                          <w:rFonts w:ascii="Cambria Math" w:eastAsiaTheme="minorEastAsia" w:hAnsi="Cambria Math"/>
+                          <w:i/>
+                          <w:highlight w:val="yellow"/>
+                        </w:rPr>
+                        <w:t xml:space="preserve"> appartient R</w:t>
+                      </w:r>
+                      <w:r>
+                        <w:rPr>
+                          <w:rFonts w:ascii="Cambria Math" w:eastAsiaTheme="minorEastAsia" w:hAnsi="Cambria Math"/>
+                          <w:i/>
+                          <w:highlight w:val="yellow"/>
+                        </w:rPr>
+                        <w:t>1</w:t>
+                      </w:r>
+                      <w:r>
+                        <w:rPr>
+                          <w:rFonts w:ascii="Cambria Math" w:eastAsiaTheme="minorEastAsia" w:hAnsi="Cambria Math"/>
+                          <w:i/>
+                          <w:highlight w:val="yellow"/>
+                        </w:rPr>
+                        <w:t xml:space="preserve"> donc k=</w:t>
+                      </w:r>
+                      <w:r>
+                        <w:rPr>
+                          <w:rFonts w:ascii="Cambria Math" w:eastAsiaTheme="minorEastAsia" w:hAnsi="Cambria Math"/>
+                          <w:i/>
+                          <w:highlight w:val="yellow"/>
+                        </w:rPr>
+                        <w:t>1</w:t>
+                      </w:r>
+                      <w:r>
+                        <w:rPr>
+                          <w:rFonts w:ascii="Cambria Math" w:eastAsiaTheme="minorEastAsia" w:hAnsi="Cambria Math"/>
+                          <w:i/>
+                          <w:highlight w:val="yellow"/>
+                        </w:rPr>
+                        <w:t xml:space="preserve"> et on ne cherche point </w:t>
+                      </w:r>
+                      <m:oMath>
+                        <m:sSub>
+                          <m:sSubPr>
+                            <m:ctrlPr>
+                              <w:rPr>
+                                <w:rFonts w:ascii="Cambria Math" w:hAnsi="Cambria Math"/>
+                                <w:i/>
+                                <w:highlight w:val="yellow"/>
+                              </w:rPr>
+                            </m:ctrlPr>
+                          </m:sSubPr>
+                          <m:e>
+                            <m:r>
+                              <w:rPr>
+                                <w:rFonts w:ascii="Cambria Math" w:hAnsi="Cambria Math"/>
+                                <w:highlight w:val="yellow"/>
+                              </w:rPr>
+                              <m:t>A</m:t>
+                            </m:r>
+                          </m:e>
+                          <m:sub>
+                            <m:r>
+                              <w:rPr>
+                                <w:rFonts w:ascii="Cambria Math" w:hAnsi="Cambria Math"/>
+                                <w:highlight w:val="yellow"/>
+                              </w:rPr>
+                              <m:t>k</m:t>
+                            </m:r>
+                          </m:sub>
+                        </m:sSub>
+                        <m:r>
+                          <w:rPr>
+                            <w:rFonts w:ascii="Cambria Math" w:hAnsi="Cambria Math"/>
+                            <w:highlight w:val="yellow"/>
+                          </w:rPr>
+                          <m:t xml:space="preserve"> </m:t>
+                        </m:r>
+                      </m:oMath>
+                      <w:r>
+                        <w:rPr>
+                          <w:rFonts w:ascii="Cambria Math" w:eastAsiaTheme="minorEastAsia" w:hAnsi="Cambria Math"/>
+                          <w:i/>
+                          <w:highlight w:val="yellow"/>
+                        </w:rPr>
+                        <w:t>qui appartient R</w:t>
+                      </w:r>
+                      <w:proofErr w:type="gramStart"/>
+                      <w:r>
+                        <w:rPr>
+                          <w:rFonts w:ascii="Cambria Math" w:eastAsiaTheme="minorEastAsia" w:hAnsi="Cambria Math"/>
+                          <w:i/>
+                          <w:highlight w:val="yellow"/>
+                        </w:rPr>
+                        <w:t>1</w:t>
+                      </w:r>
+                      <w:r>
+                        <w:rPr>
+                          <w:rFonts w:ascii="Cambria Math" w:eastAsiaTheme="minorEastAsia" w:hAnsi="Cambria Math"/>
+                          <w:i/>
+                          <w:highlight w:val="yellow"/>
+                        </w:rPr>
+                        <w:t xml:space="preserve"> </w:t>
+                      </w:r>
+                      <w:r>
+                        <w:rPr>
+                          <w:rFonts w:ascii="Cambria Math" w:eastAsiaTheme="minorEastAsia" w:hAnsi="Cambria Math"/>
+                          <w:i/>
+                          <w:highlight w:val="yellow"/>
+                        </w:rPr>
+                        <w:t>,</w:t>
+                      </w:r>
+                      <w:proofErr w:type="gramEnd"/>
+                      <w:r>
+                        <w:rPr>
+                          <w:rFonts w:ascii="Cambria Math" w:eastAsiaTheme="minorEastAsia" w:hAnsi="Cambria Math"/>
+                          <w:i/>
+                          <w:highlight w:val="yellow"/>
+                        </w:rPr>
+                        <w:t xml:space="preserve"> c’est-à-dire </w:t>
+                      </w:r>
+                      <w:r>
+                        <w:rPr>
+                          <w:rFonts w:ascii="Cambria Math" w:eastAsiaTheme="minorEastAsia" w:hAnsi="Cambria Math"/>
+                          <w:i/>
+                          <w:highlight w:val="yellow"/>
+                        </w:rPr>
+                        <w:t>O</w:t>
                       </w:r>
                       <w:r>
                         <w:rPr>
@@ -7748,7 +7754,7 @@
           </mc:Choice>
           <mc:Fallback>
             <w:pict>
-              <v:shape w14:anchorId="2B6CE674" id="Connecteur : en angle 27" o:spid="_x0000_s1026" type="#_x0000_t34" style="position:absolute;margin-left:469.45pt;margin-top:361.65pt;width:27.55pt;height:41.95pt;flip:x y;z-index:251806720;visibility:visible;mso-wrap-style:square;mso-wrap-distance-left:9pt;mso-wrap-distance-top:0;mso-wrap-distance-right:9pt;mso-wrap-distance-bottom:0;mso-position-horizontal:absolute;mso-position-horizontal-relative:text;mso-position-vertical:absolute;mso-position-vertical-relative:text" o:gfxdata="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" strokecolor="#e00" strokeweight=".5pt">
+              <v:shape w14:anchorId="41D4336C" id="Connecteur : en angle 27" o:spid="_x0000_s1026" type="#_x0000_t34" style="position:absolute;margin-left:469.45pt;margin-top:361.65pt;width:27.55pt;height:41.95pt;flip:x y;z-index:251806720;visibility:visible;mso-wrap-style:square;mso-wrap-distance-left:9pt;mso-wrap-distance-top:0;mso-wrap-distance-right:9pt;mso-wrap-distance-bottom:0;mso-position-horizontal:absolute;mso-position-horizontal-relative:text;mso-position-vertical:absolute;mso-position-vertical-relative:text" o:gfxdata="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" strokecolor="#e00" strokeweight=".5pt">
                 <v:stroke endarrow="block"/>
               </v:shape>
             </w:pict>
@@ -10659,7 +10665,7 @@
           </mc:Choice>
           <mc:Fallback>
             <w:pict>
-              <v:shape w14:anchorId="0879ECDD" id="Connecteur : en angle 20" o:spid="_x0000_s1026" type="#_x0000_t34" style="position:absolute;margin-left:-18.7pt;margin-top:19.4pt;width:20.65pt;height:20.65pt;z-index:251763712;visibility:visible;mso-wrap-style:square;mso-wrap-distance-left:9pt;mso-wrap-distance-top:0;mso-wrap-distance-right:9pt;mso-wrap-distance-bottom:0;mso-position-horizontal:absolute;mso-position-horizontal-relative:text;mso-position-vertical:absolute;mso-position-vertical-relative:text" o:gfxdata="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" adj="12103" strokecolor="#e00" strokeweight="2.25pt">
+              <v:shape w14:anchorId="1910C439" id="Connecteur : en angle 20" o:spid="_x0000_s1026" type="#_x0000_t34" style="position:absolute;margin-left:-18.7pt;margin-top:19.4pt;width:20.65pt;height:20.65pt;z-index:251763712;visibility:visible;mso-wrap-style:square;mso-wrap-distance-left:9pt;mso-wrap-distance-top:0;mso-wrap-distance-right:9pt;mso-wrap-distance-bottom:0;mso-position-horizontal:absolute;mso-position-horizontal-relative:text;mso-position-vertical:absolute;mso-position-vertical-relative:text" o:gfxdata="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" adj="12103" strokecolor="#e00" strokeweight="2.25pt">
                 <v:stroke endarrow="block"/>
               </v:shape>
             </w:pict>
@@ -11345,7 +11351,7 @@
         <v:path o:extrusionok="f" gradientshapeok="t" o:connecttype="rect"/>
         <o:lock v:ext="edit" aspectratio="t"/>
       </v:shapetype>
-      <v:shape id="_x0000_i1142" type="#_x0000_t75" style="width:11.25pt;height:11.25pt" o:bullet="t">
+      <v:shape id="_x0000_i1145" type="#_x0000_t75" style="width:11.25pt;height:11.25pt" o:bullet="t">
         <v:imagedata r:id="rId1" o:title="mso9BE0"/>
       </v:shape>
     </w:pict>

</xml_diff>